<commit_message>
Atualização do link do vídeo no relatório
</commit_message>
<xml_diff>
--- a/docs/relatorio_executivo.docx
+++ b/docs/relatorio_executivo.docx
@@ -106,8 +106,14 @@
     <w:p>
       <w:pPr>
         <w:pStyle w:val="Heading2"/>
+        <w:rPr>
+          <w:lang w:val="pt-BR"/>
+        </w:rPr>
       </w:pPr>
       <w:r>
+        <w:rPr>
+          <w:lang w:val="pt-BR"/>
+        </w:rPr>
         <w:t xml:space="preserve">1. Sumário </w:t>
       </w:r>
     </w:p>
@@ -425,42 +431,104 @@
         </w:rPr>
       </w:pPr>
       <w:r>
+        <w:rPr>
+          <w:lang w:val="pt-BR"/>
+        </w:rPr>
         <w:t xml:space="preserve">Fonte: </w:t>
       </w:r>
       <w:hyperlink r:id="rId6" w:history="1">
+        <w:proofErr w:type="spellStart"/>
         <w:r>
           <w:rPr>
             <w:rStyle w:val="Hyperlink"/>
             <w:i/>
+            <w:lang w:val="pt-BR"/>
           </w:rPr>
-          <w:t xml:space="preserve">Brazilian E-Commerce Public </w:t>
+          <w:t>Brazilian</w:t>
         </w:r>
+        <w:proofErr w:type="spellEnd"/>
         <w:r>
           <w:rPr>
             <w:rStyle w:val="Hyperlink"/>
             <w:i/>
+            <w:lang w:val="pt-BR"/>
           </w:rPr>
-          <w:t>D</w:t>
-        </w:r>
-        <w:r>
-          <w:rPr>
-            <w:rStyle w:val="Hyperlink"/>
-            <w:i/>
-          </w:rPr>
-          <w:t xml:space="preserve">ataset by </w:t>
+          <w:t xml:space="preserve"> E-Commerce </w:t>
         </w:r>
         <w:proofErr w:type="spellStart"/>
         <w:r>
           <w:rPr>
             <w:rStyle w:val="Hyperlink"/>
             <w:i/>
+            <w:lang w:val="pt-BR"/>
           </w:rPr>
-          <w:t>Olist</w:t>
+          <w:t>Public</w:t>
         </w:r>
         <w:proofErr w:type="spellEnd"/>
+        <w:r>
+          <w:rPr>
+            <w:rStyle w:val="Hyperlink"/>
+            <w:i/>
+            <w:lang w:val="pt-BR"/>
+          </w:rPr>
+          <w:t xml:space="preserve"> </w:t>
+        </w:r>
+        <w:proofErr w:type="spellStart"/>
+        <w:r>
+          <w:rPr>
+            <w:rStyle w:val="Hyperlink"/>
+            <w:i/>
+            <w:lang w:val="pt-BR"/>
+          </w:rPr>
+          <w:t>Dataset</w:t>
+        </w:r>
+        <w:proofErr w:type="spellEnd"/>
+        <w:r>
+          <w:rPr>
+            <w:rStyle w:val="Hyperlink"/>
+            <w:i/>
+            <w:lang w:val="pt-BR"/>
+          </w:rPr>
+          <w:t xml:space="preserve"> </w:t>
+        </w:r>
+        <w:proofErr w:type="spellStart"/>
+        <w:r>
+          <w:rPr>
+            <w:rStyle w:val="Hyperlink"/>
+            <w:i/>
+            <w:lang w:val="pt-BR"/>
+          </w:rPr>
+          <w:t>by</w:t>
+        </w:r>
+        <w:proofErr w:type="spellEnd"/>
+        <w:r>
+          <w:rPr>
+            <w:rStyle w:val="Hyperlink"/>
+            <w:i/>
+            <w:lang w:val="pt-BR"/>
+          </w:rPr>
+          <w:t xml:space="preserve"> Olist</w:t>
+        </w:r>
       </w:hyperlink>
       <w:r>
-        <w:t xml:space="preserve"> (Kaggle). </w:t>
+        <w:rPr>
+          <w:lang w:val="pt-BR"/>
+        </w:rPr>
+        <w:t xml:space="preserve"> (</w:t>
+      </w:r>
+      <w:proofErr w:type="spellStart"/>
+      <w:r>
+        <w:rPr>
+          <w:lang w:val="pt-BR"/>
+        </w:rPr>
+        <w:t>Kaggle</w:t>
+      </w:r>
+      <w:proofErr w:type="spellEnd"/>
+      <w:r>
+        <w:rPr>
+          <w:lang w:val="pt-BR"/>
+        </w:rPr>
+        <w:t xml:space="preserve">). </w:t>
       </w:r>
       <w:r>
         <w:rPr>
@@ -738,21 +806,49 @@
               <w:rPr>
                 <w:lang w:val="pt-BR"/>
               </w:rPr>
-              <w:t xml:space="preserve">Pessoa ( </w:t>
+              <w:t xml:space="preserve">Pessoa </w:t>
+            </w:r>
+            <w:proofErr w:type="gramStart"/>
+            <w:r>
+              <w:rPr>
+                <w:lang w:val="pt-BR"/>
+              </w:rPr>
+              <w:t xml:space="preserve">( </w:t>
             </w:r>
             <w:proofErr w:type="spellStart"/>
             <w:r>
               <w:rPr>
                 <w:lang w:val="pt-BR"/>
               </w:rPr>
-              <w:t>customer_unique_id</w:t>
+              <w:t>customer</w:t>
+            </w:r>
+            <w:proofErr w:type="gramEnd"/>
+            <w:r>
+              <w:rPr>
+                <w:lang w:val="pt-BR"/>
+              </w:rPr>
+              <w:t>_unique_</w:t>
+            </w:r>
+            <w:proofErr w:type="gramStart"/>
+            <w:r>
+              <w:rPr>
+                <w:lang w:val="pt-BR"/>
+              </w:rPr>
+              <w:t>id</w:t>
             </w:r>
             <w:proofErr w:type="spellEnd"/>
             <w:r>
               <w:rPr>
                 <w:lang w:val="pt-BR"/>
               </w:rPr>
-              <w:t xml:space="preserve"> ) e UF</w:t>
+              <w:t xml:space="preserve"> )</w:t>
+            </w:r>
+            <w:proofErr w:type="gramEnd"/>
+            <w:r>
+              <w:rPr>
+                <w:lang w:val="pt-BR"/>
+              </w:rPr>
+              <w:t xml:space="preserve"> e UF</w:t>
             </w:r>
           </w:p>
         </w:tc>
@@ -1178,7 +1274,21 @@
         <w:rPr>
           <w:lang w:val="pt-BR"/>
         </w:rPr>
-        <w:t>Isso importa para o agente: a mesma regra nacional esconde risco maior no RJ e no Nordeste.</w:t>
+        <w:t xml:space="preserve">Isso importa para o agente: </w:t>
+      </w:r>
+      <w:proofErr w:type="gramStart"/>
+      <w:r>
+        <w:rPr>
+          <w:lang w:val="pt-BR"/>
+        </w:rPr>
+        <w:t>a mesma</w:t>
+      </w:r>
+      <w:proofErr w:type="gramEnd"/>
+      <w:r>
+        <w:rPr>
+          <w:lang w:val="pt-BR"/>
+        </w:rPr>
+        <w:t xml:space="preserve"> regra nacional esconde risco maior no RJ e no Nordeste.</w:t>
       </w:r>
     </w:p>
     <w:p>
@@ -5209,7 +5319,25 @@
           <w:sz w:val="20"/>
           <w:szCs w:val="20"/>
         </w:rPr>
-        <w:t xml:space="preserve"> entregue? </w:t>
+        <w:t xml:space="preserve"> </w:t>
+      </w:r>
+      <w:proofErr w:type="spellStart"/>
+      <w:r>
+        <w:rPr>
+          <w:rFonts w:ascii="Courier" w:hAnsi="Courier"/>
+          <w:sz w:val="20"/>
+          <w:szCs w:val="20"/>
+        </w:rPr>
+        <w:t>entregue</w:t>
+      </w:r>
+      <w:proofErr w:type="spellEnd"/>
+      <w:r>
+        <w:rPr>
+          <w:rFonts w:ascii="Courier" w:hAnsi="Courier"/>
+          <w:sz w:val="20"/>
+          <w:szCs w:val="20"/>
+        </w:rPr>
+        <w:t xml:space="preserve">? </w:t>
       </w:r>
       <w:r>
         <w:rPr>
@@ -6000,6 +6128,7 @@
         <w:br/>
         <w:t xml:space="preserve">**Texto para o cliente:** Seu pedido OL-1001 tem prazo até 12/08. Se houver qualquer atraso, avisaremos. </w:t>
       </w:r>
+      <w:proofErr w:type="gramStart"/>
       <w:r>
         <w:rPr>
           <w:rFonts w:ascii="Courier" w:hAnsi="Courier"/>
@@ -6009,6 +6138,7 @@
         </w:rPr>
         <w:t>Qualquer novidade, este canal continua</w:t>
       </w:r>
+      <w:proofErr w:type="gramEnd"/>
       <w:r>
         <w:rPr>
           <w:rFonts w:ascii="Courier" w:hAnsi="Courier"/>
@@ -6733,6 +6863,11 @@
       </w:r>
     </w:p>
     <w:p>
+      <w:pPr>
+        <w:rPr>
+          <w:lang w:val="pt-BR"/>
+        </w:rPr>
+      </w:pPr>
       <w:r>
         <w:rPr>
           <w:lang w:val="pt-BR"/>
@@ -6747,26 +6882,29 @@
         <w:t xml:space="preserve">Código do pedido, nota, título, comentário, status do pedido, se houve atraso, categoria. </w:t>
       </w:r>
       <w:r>
-        <w:t xml:space="preserve">Sem dados </w:t>
-      </w:r>
-      <w:proofErr w:type="spellStart"/>
-      <w:r>
-        <w:t>pessoais</w:t>
-      </w:r>
-      <w:proofErr w:type="spellEnd"/>
-      <w:r>
-        <w:t>.</w:t>
-      </w:r>
-    </w:p>
-    <w:p>
-      <w:r>
-        <w:lastRenderedPageBreak/>
-        <w:t>c) Instrução (prompt)</w:t>
+        <w:rPr>
+          <w:lang w:val="pt-BR"/>
+        </w:rPr>
+        <w:t>Sem dados pessoais.</w:t>
       </w:r>
     </w:p>
     <w:p>
       <w:pPr>
         <w:rPr>
+          <w:lang w:val="pt-BR"/>
+        </w:rPr>
+      </w:pPr>
+      <w:r>
+        <w:rPr>
+          <w:lang w:val="pt-BR"/>
+        </w:rPr>
+        <w:lastRenderedPageBreak/>
+        <w:t>c) Instrução (prompt)</w:t>
+      </w:r>
+    </w:p>
+    <w:p>
+      <w:pPr>
+        <w:rPr>
           <w:sz w:val="20"/>
           <w:szCs w:val="20"/>
           <w:lang w:val="pt-BR"/>
@@ -8399,7 +8537,27 @@
           <w:lang w:val="pt-BR"/>
         </w:rPr>
         <w:br/>
-        <w:t>Agora analise:</w:t>
+        <w:t xml:space="preserve">Agora </w:t>
+      </w:r>
+      <w:proofErr w:type="gramStart"/>
+      <w:r>
+        <w:rPr>
+          <w:rFonts w:ascii="Courier" w:hAnsi="Courier"/>
+          <w:sz w:val="20"/>
+          <w:szCs w:val="20"/>
+          <w:lang w:val="pt-BR"/>
+        </w:rPr>
+        <w:t>analise</w:t>
+      </w:r>
+      <w:proofErr w:type="gramEnd"/>
+      <w:r>
+        <w:rPr>
+          <w:rFonts w:ascii="Courier" w:hAnsi="Courier"/>
+          <w:sz w:val="20"/>
+          <w:szCs w:val="20"/>
+          <w:lang w:val="pt-BR"/>
+        </w:rPr>
+        <w:t>:</w:t>
       </w:r>
       <w:r>
         <w:rPr>
@@ -8468,7 +8626,46 @@
           <w:lang w:val="pt-BR"/>
         </w:rPr>
         <w:br/>
-        <w:t>titulo: ${titulo}</w:t>
+      </w:r>
+      <w:proofErr w:type="gramStart"/>
+      <w:r>
+        <w:rPr>
+          <w:rFonts w:ascii="Courier" w:hAnsi="Courier"/>
+          <w:sz w:val="20"/>
+          <w:szCs w:val="20"/>
+          <w:lang w:val="pt-BR"/>
+        </w:rPr>
+        <w:t>titulo</w:t>
+      </w:r>
+      <w:proofErr w:type="gramEnd"/>
+      <w:r>
+        <w:rPr>
+          <w:rFonts w:ascii="Courier" w:hAnsi="Courier"/>
+          <w:sz w:val="20"/>
+          <w:szCs w:val="20"/>
+          <w:lang w:val="pt-BR"/>
+        </w:rPr>
+        <w:t>: ${</w:t>
+      </w:r>
+      <w:proofErr w:type="gramStart"/>
+      <w:r>
+        <w:rPr>
+          <w:rFonts w:ascii="Courier" w:hAnsi="Courier"/>
+          <w:sz w:val="20"/>
+          <w:szCs w:val="20"/>
+          <w:lang w:val="pt-BR"/>
+        </w:rPr>
+        <w:t>titulo</w:t>
+      </w:r>
+      <w:proofErr w:type="gramEnd"/>
+      <w:r>
+        <w:rPr>
+          <w:rFonts w:ascii="Courier" w:hAnsi="Courier"/>
+          <w:sz w:val="20"/>
+          <w:szCs w:val="20"/>
+          <w:lang w:val="pt-BR"/>
+        </w:rPr>
+        <w:t>}</w:t>
       </w:r>
       <w:r>
         <w:rPr>
@@ -8866,7 +9063,21 @@
         <w:rPr>
           <w:lang w:val="pt-BR"/>
         </w:rPr>
-        <w:t>Resumo — no máximo 2 frases, fieis ao que o cliente escreveu (ou “sem comentário” se só houver nota).</w:t>
+        <w:t xml:space="preserve">Resumo — no máximo 2 frases, </w:t>
+      </w:r>
+      <w:proofErr w:type="gramStart"/>
+      <w:r>
+        <w:rPr>
+          <w:lang w:val="pt-BR"/>
+        </w:rPr>
+        <w:t>fieis</w:t>
+      </w:r>
+      <w:proofErr w:type="gramEnd"/>
+      <w:r>
+        <w:rPr>
+          <w:lang w:val="pt-BR"/>
+        </w:rPr>
+        <w:t xml:space="preserve"> ao que o cliente escreveu (ou “sem comentário” se só houver nota).</w:t>
       </w:r>
     </w:p>
     <w:p>
@@ -10252,7 +10463,27 @@
           <w:szCs w:val="20"/>
           <w:lang w:val="pt-BR"/>
         </w:rPr>
-        <w:t>, nota 1–2 ou atraso? → não contactar e preencha Não ofertar</w:t>
+        <w:t xml:space="preserve">, nota 1–2 ou atraso? → não contactar e </w:t>
+      </w:r>
+      <w:proofErr w:type="gramStart"/>
+      <w:r>
+        <w:rPr>
+          <w:rFonts w:ascii="Courier" w:hAnsi="Courier"/>
+          <w:sz w:val="20"/>
+          <w:szCs w:val="20"/>
+          <w:lang w:val="pt-BR"/>
+        </w:rPr>
+        <w:t>preencha Não</w:t>
+      </w:r>
+      <w:proofErr w:type="gramEnd"/>
+      <w:r>
+        <w:rPr>
+          <w:rFonts w:ascii="Courier" w:hAnsi="Courier"/>
+          <w:sz w:val="20"/>
+          <w:szCs w:val="20"/>
+          <w:lang w:val="pt-BR"/>
+        </w:rPr>
+        <w:t xml:space="preserve"> ofertar</w:t>
       </w:r>
       <w:r>
         <w:rPr>
@@ -11011,7 +11242,27 @@
           <w:lang w:val="pt-BR"/>
         </w:rPr>
         <w:br/>
-        <w:t>Agora analise:</w:t>
+        <w:t xml:space="preserve">Agora </w:t>
+      </w:r>
+      <w:proofErr w:type="gramStart"/>
+      <w:r>
+        <w:rPr>
+          <w:rFonts w:ascii="Courier" w:hAnsi="Courier"/>
+          <w:sz w:val="20"/>
+          <w:szCs w:val="20"/>
+          <w:lang w:val="pt-BR"/>
+        </w:rPr>
+        <w:t>analise</w:t>
+      </w:r>
+      <w:proofErr w:type="gramEnd"/>
+      <w:r>
+        <w:rPr>
+          <w:rFonts w:ascii="Courier" w:hAnsi="Courier"/>
+          <w:sz w:val="20"/>
+          <w:szCs w:val="20"/>
+          <w:lang w:val="pt-BR"/>
+        </w:rPr>
+        <w:t>:</w:t>
       </w:r>
       <w:r>
         <w:rPr>
@@ -11160,14 +11411,25 @@
         <w:br/>
       </w:r>
       <w:proofErr w:type="spellStart"/>
-      <w:r>
-        <w:rPr>
-          <w:rFonts w:ascii="Courier" w:hAnsi="Courier"/>
-          <w:sz w:val="20"/>
-          <w:szCs w:val="20"/>
-          <w:lang w:val="pt-BR"/>
-        </w:rPr>
-        <w:t>ultima_compra</w:t>
+      <w:proofErr w:type="gramStart"/>
+      <w:r>
+        <w:rPr>
+          <w:rFonts w:ascii="Courier" w:hAnsi="Courier"/>
+          <w:sz w:val="20"/>
+          <w:szCs w:val="20"/>
+          <w:lang w:val="pt-BR"/>
+        </w:rPr>
+        <w:t>ultima</w:t>
+      </w:r>
+      <w:proofErr w:type="gramEnd"/>
+      <w:r>
+        <w:rPr>
+          <w:rFonts w:ascii="Courier" w:hAnsi="Courier"/>
+          <w:sz w:val="20"/>
+          <w:szCs w:val="20"/>
+          <w:lang w:val="pt-BR"/>
+        </w:rPr>
+        <w:t>_compra</w:t>
       </w:r>
       <w:proofErr w:type="spellEnd"/>
       <w:r>
@@ -11180,14 +11442,25 @@
         <w:t>: ${</w:t>
       </w:r>
       <w:proofErr w:type="spellStart"/>
-      <w:r>
-        <w:rPr>
-          <w:rFonts w:ascii="Courier" w:hAnsi="Courier"/>
-          <w:sz w:val="20"/>
-          <w:szCs w:val="20"/>
-          <w:lang w:val="pt-BR"/>
-        </w:rPr>
-        <w:t>ultima_compra</w:t>
+      <w:proofErr w:type="gramStart"/>
+      <w:r>
+        <w:rPr>
+          <w:rFonts w:ascii="Courier" w:hAnsi="Courier"/>
+          <w:sz w:val="20"/>
+          <w:szCs w:val="20"/>
+          <w:lang w:val="pt-BR"/>
+        </w:rPr>
+        <w:t>ultima</w:t>
+      </w:r>
+      <w:proofErr w:type="gramEnd"/>
+      <w:r>
+        <w:rPr>
+          <w:rFonts w:ascii="Courier" w:hAnsi="Courier"/>
+          <w:sz w:val="20"/>
+          <w:szCs w:val="20"/>
+          <w:lang w:val="pt-BR"/>
+        </w:rPr>
+        <w:t>_compra</w:t>
       </w:r>
       <w:proofErr w:type="spellEnd"/>
       <w:r>
@@ -11209,14 +11482,25 @@
         <w:br/>
       </w:r>
       <w:proofErr w:type="spellStart"/>
-      <w:r>
-        <w:rPr>
-          <w:rFonts w:ascii="Courier" w:hAnsi="Courier"/>
-          <w:sz w:val="20"/>
-          <w:szCs w:val="20"/>
-          <w:lang w:val="pt-BR"/>
-        </w:rPr>
-        <w:t>ultima_nota</w:t>
+      <w:proofErr w:type="gramStart"/>
+      <w:r>
+        <w:rPr>
+          <w:rFonts w:ascii="Courier" w:hAnsi="Courier"/>
+          <w:sz w:val="20"/>
+          <w:szCs w:val="20"/>
+          <w:lang w:val="pt-BR"/>
+        </w:rPr>
+        <w:t>ultima</w:t>
+      </w:r>
+      <w:proofErr w:type="gramEnd"/>
+      <w:r>
+        <w:rPr>
+          <w:rFonts w:ascii="Courier" w:hAnsi="Courier"/>
+          <w:sz w:val="20"/>
+          <w:szCs w:val="20"/>
+          <w:lang w:val="pt-BR"/>
+        </w:rPr>
+        <w:t>_nota</w:t>
       </w:r>
       <w:proofErr w:type="spellEnd"/>
       <w:r>
@@ -11229,14 +11513,25 @@
         <w:t>: ${</w:t>
       </w:r>
       <w:proofErr w:type="spellStart"/>
-      <w:r>
-        <w:rPr>
-          <w:rFonts w:ascii="Courier" w:hAnsi="Courier"/>
-          <w:sz w:val="20"/>
-          <w:szCs w:val="20"/>
-          <w:lang w:val="pt-BR"/>
-        </w:rPr>
-        <w:t>ultima_nota</w:t>
+      <w:proofErr w:type="gramStart"/>
+      <w:r>
+        <w:rPr>
+          <w:rFonts w:ascii="Courier" w:hAnsi="Courier"/>
+          <w:sz w:val="20"/>
+          <w:szCs w:val="20"/>
+          <w:lang w:val="pt-BR"/>
+        </w:rPr>
+        <w:t>ultima</w:t>
+      </w:r>
+      <w:proofErr w:type="gramEnd"/>
+      <w:r>
+        <w:rPr>
+          <w:rFonts w:ascii="Courier" w:hAnsi="Courier"/>
+          <w:sz w:val="20"/>
+          <w:szCs w:val="20"/>
+          <w:lang w:val="pt-BR"/>
+        </w:rPr>
+        <w:t>_nota</w:t>
       </w:r>
       <w:proofErr w:type="spellEnd"/>
       <w:r>
@@ -11258,14 +11553,25 @@
         <w:br/>
       </w:r>
       <w:proofErr w:type="spellStart"/>
-      <w:r>
-        <w:rPr>
-          <w:rFonts w:ascii="Courier" w:hAnsi="Courier"/>
-          <w:sz w:val="20"/>
-          <w:szCs w:val="20"/>
-          <w:lang w:val="pt-BR"/>
-        </w:rPr>
-        <w:t>ultima_entrega_atrasou</w:t>
+      <w:proofErr w:type="gramStart"/>
+      <w:r>
+        <w:rPr>
+          <w:rFonts w:ascii="Courier" w:hAnsi="Courier"/>
+          <w:sz w:val="20"/>
+          <w:szCs w:val="20"/>
+          <w:lang w:val="pt-BR"/>
+        </w:rPr>
+        <w:t>ultima</w:t>
+      </w:r>
+      <w:proofErr w:type="gramEnd"/>
+      <w:r>
+        <w:rPr>
+          <w:rFonts w:ascii="Courier" w:hAnsi="Courier"/>
+          <w:sz w:val="20"/>
+          <w:szCs w:val="20"/>
+          <w:lang w:val="pt-BR"/>
+        </w:rPr>
+        <w:t>_entrega_atrasou</w:t>
       </w:r>
       <w:proofErr w:type="spellEnd"/>
       <w:r>
@@ -11278,14 +11584,25 @@
         <w:t>: ${</w:t>
       </w:r>
       <w:proofErr w:type="spellStart"/>
-      <w:r>
-        <w:rPr>
-          <w:rFonts w:ascii="Courier" w:hAnsi="Courier"/>
-          <w:sz w:val="20"/>
-          <w:szCs w:val="20"/>
-          <w:lang w:val="pt-BR"/>
-        </w:rPr>
-        <w:t>ultima_entrega_atrasou</w:t>
+      <w:proofErr w:type="gramStart"/>
+      <w:r>
+        <w:rPr>
+          <w:rFonts w:ascii="Courier" w:hAnsi="Courier"/>
+          <w:sz w:val="20"/>
+          <w:szCs w:val="20"/>
+          <w:lang w:val="pt-BR"/>
+        </w:rPr>
+        <w:t>ultima</w:t>
+      </w:r>
+      <w:proofErr w:type="gramEnd"/>
+      <w:r>
+        <w:rPr>
+          <w:rFonts w:ascii="Courier" w:hAnsi="Courier"/>
+          <w:sz w:val="20"/>
+          <w:szCs w:val="20"/>
+          <w:lang w:val="pt-BR"/>
+        </w:rPr>
+        <w:t>_entrega_atrasou</w:t>
       </w:r>
       <w:proofErr w:type="spellEnd"/>
       <w:r>
@@ -11448,35 +11765,7 @@
         <w:rPr>
           <w:lang w:val="pt-BR"/>
         </w:rPr>
-        <w:t xml:space="preserve">O </w:t>
-      </w:r>
-      <w:proofErr w:type="spellStart"/>
-      <w:r>
-        <w:rPr>
-          <w:lang w:val="pt-BR"/>
-        </w:rPr>
-        <w:t>que</w:t>
-      </w:r>
-      <w:proofErr w:type="spellEnd"/>
-      <w:r>
-        <w:rPr>
-          <w:lang w:val="pt-BR"/>
-        </w:rPr>
-        <w:t xml:space="preserve"> </w:t>
-      </w:r>
-      <w:proofErr w:type="spellStart"/>
-      <w:r>
-        <w:rPr>
-          <w:lang w:val="pt-BR"/>
-        </w:rPr>
-        <w:t>deve</w:t>
-      </w:r>
-      <w:proofErr w:type="spellEnd"/>
-      <w:r>
-        <w:rPr>
-          <w:lang w:val="pt-BR"/>
-        </w:rPr>
-        <w:t xml:space="preserve"> vir:</w:t>
+        <w:t>O que deve vir:</w:t>
       </w:r>
     </w:p>
     <w:p>
@@ -11875,16 +12164,16 @@
       </w:r>
     </w:p>
     <w:p>
-      <w:r>
-        <w:t xml:space="preserve">c) </w:t>
-      </w:r>
-      <w:proofErr w:type="spellStart"/>
-      <w:r>
-        <w:t>Instrução</w:t>
-      </w:r>
-      <w:proofErr w:type="spellEnd"/>
-      <w:r>
-        <w:t xml:space="preserve"> (prompt)</w:t>
+      <w:pPr>
+        <w:rPr>
+          <w:lang w:val="pt-BR"/>
+        </w:rPr>
+      </w:pPr>
+      <w:r>
+        <w:rPr>
+          <w:lang w:val="pt-BR"/>
+        </w:rPr>
+        <w:t>c) Instrução (prompt)</w:t>
       </w:r>
     </w:p>
     <w:p>
@@ -13732,7 +14021,27 @@
           <w:lang w:val="pt-BR"/>
         </w:rPr>
         <w:br/>
-        <w:t>Agora analise:</w:t>
+        <w:t xml:space="preserve">Agora </w:t>
+      </w:r>
+      <w:proofErr w:type="gramStart"/>
+      <w:r>
+        <w:rPr>
+          <w:rFonts w:ascii="Courier" w:hAnsi="Courier"/>
+          <w:sz w:val="20"/>
+          <w:szCs w:val="20"/>
+          <w:lang w:val="pt-BR"/>
+        </w:rPr>
+        <w:t>analise</w:t>
+      </w:r>
+      <w:proofErr w:type="gramEnd"/>
+      <w:r>
+        <w:rPr>
+          <w:rFonts w:ascii="Courier" w:hAnsi="Courier"/>
+          <w:sz w:val="20"/>
+          <w:szCs w:val="20"/>
+          <w:lang w:val="pt-BR"/>
+        </w:rPr>
+        <w:t>:</w:t>
       </w:r>
       <w:r>
         <w:rPr>
@@ -14003,35 +14312,7 @@
         <w:rPr>
           <w:lang w:val="pt-BR"/>
         </w:rPr>
-        <w:t xml:space="preserve">O </w:t>
-      </w:r>
-      <w:proofErr w:type="spellStart"/>
-      <w:r>
-        <w:rPr>
-          <w:lang w:val="pt-BR"/>
-        </w:rPr>
-        <w:t>que</w:t>
-      </w:r>
-      <w:proofErr w:type="spellEnd"/>
-      <w:r>
-        <w:rPr>
-          <w:lang w:val="pt-BR"/>
-        </w:rPr>
-        <w:t xml:space="preserve"> </w:t>
-      </w:r>
-      <w:proofErr w:type="spellStart"/>
-      <w:r>
-        <w:rPr>
-          <w:lang w:val="pt-BR"/>
-        </w:rPr>
-        <w:t>deve</w:t>
-      </w:r>
-      <w:proofErr w:type="spellEnd"/>
-      <w:r>
-        <w:rPr>
-          <w:lang w:val="pt-BR"/>
-        </w:rPr>
-        <w:t xml:space="preserve"> vir:</w:t>
+        <w:t>O que deve vir:</w:t>
       </w:r>
     </w:p>
     <w:p>
@@ -14722,15 +15003,27 @@
     </w:p>
     <w:p>
       <w:pPr>
+        <w:pBdr>
+          <w:bottom w:val="single" w:sz="6" w:space="1" w:color="auto"/>
+        </w:pBdr>
         <w:rPr>
           <w:lang w:val="pt-BR"/>
         </w:rPr>
       </w:pPr>
-      <w:r>
-        <w:rPr>
-          <w:lang w:val="pt-BR"/>
-        </w:rPr>
-        <w:t>Link do vídeo (YouTube, Drive ou similar): ainda não gravado — inserir aqui após a publicação.</w:t>
+      <w:hyperlink r:id="rId16" w:history="1">
+        <w:r>
+          <w:rPr>
+            <w:rStyle w:val="Hyperlink"/>
+            <w:lang w:val="pt-BR"/>
+          </w:rPr>
+          <w:t>Apresentação executiva</w:t>
+        </w:r>
+      </w:hyperlink>
+      <w:r>
+        <w:rPr>
+          <w:lang w:val="pt-BR"/>
+        </w:rPr>
+        <w:t xml:space="preserve"> disponível para download.</w:t>
       </w:r>
     </w:p>
     <w:p>

</xml_diff>